<commit_message>
docs: realign Описание/Иллюстрированное group headings to the new sidebar layout (v1.44)
Section blocks (heading + body + image) moved under the new 11 group headings (Обзор,
Планирование, Бэклог и приоритизация, …, Система, Справка), matching the regrouped app
accordion. All 59 sections and 66 images preserved; intro and «Доступ…» sections kept.
Done with a guarded script that aborts without saving on any 1:1 mismatch. Synced frontend/docs.
The user guide keeps its how-to numbering (not a NAV mirror).

Co-Authored-By: Claude Opus 4.8 <noreply@anthropic.com>
</commit_message>
<xml_diff>
--- a/Описание_Планирование_спринта_PRO.docx
+++ b/Описание_Планирование_спринта_PRO.docx
@@ -64,7 +64,7 @@
         <w:pStyle w:val="Heading1"/>
       </w:pPr>
       <w:r>
-        <w:t>Планирование</w:t>
+        <w:t>Обзор</w:t>
       </w:r>
     </w:p>
     <w:p>
@@ -94,21 +94,35 @@
         <w:pStyle w:val="Heading2"/>
       </w:pPr>
       <w:r>
-        <w:t>Доска (интерактивный холст)</w:t>
-      </w:r>
-    </w:p>
-    <w:p>
-      <w:r>
-        <w:t>Бесконечный цифровой холст для совместной визуальной работы (аналог Miro): стикеры с автором и голосованием, текст, фигуры, стрелки-связи, карандаш, изображения и фреймы. Живая совместная работа в реальном времени, курсоры участников, экспорт в PNG/PDF.</w:t>
+        <w:t>Статус-отчёт</w:t>
       </w:r>
     </w:p>
     <w:p>
       <w:pPr/>
       <w:r>
-        <w:rPr>
-          <w:i/>
-        </w:rPr>
-        <w:t>Новое в v1.41: эмодзи-стикеры и анимация элементов (пульс, подпрыгивание, вращение, парение, мигание); авто-стрелки между фигурами — связи привязываются к фигурам и следуют за ними; быстрое построение схем без перетаскивания — кнопки «+» у выделенной фигуры создают её копию со стрелкой; ссылки на внешние ресурсы и документы с просмотром во встроенном окне.</w:t>
+        <w:t>Автоматический статус-отчёт (RAG) из текущих данных проекта: ключевые метрики, цель спринта, риски, эскалации и сделанное. Экспорт в Markdown и отправка в Slack.</w:t>
+      </w:r>
+    </w:p>
+    <w:p>
+      <w:pPr>
+        <w:pStyle w:val="Heading2"/>
+      </w:pPr>
+      <w:r>
+        <w:t>Портфель</w:t>
+      </w:r>
+    </w:p>
+    <w:p>
+      <w:pPr/>
+      <w:r>
+        <w:t>Портфельный обзор нескольких проектов: статус RAG, health, velocity, бюджет и прогресс. Кнопка «Снимок текущего проекта» добавляет метрики активного проекта. Обзор здоровья портфеля для PMO.</w:t>
+      </w:r>
+    </w:p>
+    <w:p>
+      <w:pPr>
+        <w:pStyle w:val="Heading1"/>
+      </w:pPr>
+      <w:r>
+        <w:t>Планирование</w:t>
       </w:r>
     </w:p>
     <w:p>
@@ -138,6 +152,33 @@
         <w:pStyle w:val="Heading2"/>
       </w:pPr>
       <w:r>
+        <w:t>Кварталы</w:t>
+      </w:r>
+    </w:p>
+    <w:p>
+      <w:r>
+        <w:t>Агрегация по календарным кварталам: ёмкость, план, velocity, загрузка и процент выполнения, а также квартальный roadmap со спринтами на шкале дат.</w:t>
+      </w:r>
+    </w:p>
+    <w:p>
+      <w:pPr>
+        <w:pStyle w:val="Heading2"/>
+      </w:pPr>
+      <w:r>
+        <w:t>Цели спринтов</w:t>
+      </w:r>
+    </w:p>
+    <w:p>
+      <w:pPr/>
+      <w:r>
+        <w:t>Sprint Goal по каждому спринту — единое обязательство команды о создаваемой ценности (а не список задач). У каждой цели есть статус (Запланирована / В работе / Достигнута / Не достигнута / Отменена), а столбец «% факт» считается автоматически как доля задач спринта в статусе «Готово». Текущая цель спринта и её статус выводятся на дашборд.</w:t>
+      </w:r>
+    </w:p>
+    <w:p>
+      <w:pPr>
+        <w:pStyle w:val="Heading2"/>
+      </w:pPr>
+      <w:r>
         <w:t>Kanban-доска</w:t>
       </w:r>
     </w:p>
@@ -160,12 +201,78 @@
         <w:pStyle w:val="Heading2"/>
       </w:pPr>
       <w:r>
-        <w:t>Кварталы</w:t>
+        <w:t>Доска (интерактивный холст)</w:t>
       </w:r>
     </w:p>
     <w:p>
       <w:r>
-        <w:t>Агрегация по календарным кварталам: ёмкость, план, velocity, загрузка и процент выполнения, а также квартальный roadmap со спринтами на шкале дат.</w:t>
+        <w:t>Бесконечный цифровой холст для совместной визуальной работы (аналог Miro): стикеры с автором и голосованием, текст, фигуры, стрелки-связи, карандаш, изображения и фреймы. Живая совместная работа в реальном времени, курсоры участников, экспорт в PNG/PDF.</w:t>
+      </w:r>
+    </w:p>
+    <w:p>
+      <w:pPr/>
+      <w:r>
+        <w:rPr>
+          <w:i/>
+        </w:rPr>
+        <w:t>Новое в v1.41: эмодзи-стикеры и анимация элементов (пульс, подпрыгивание, вращение, парение, мигание); авто-стрелки между фигурами — связи привязываются к фигурам и следуют за ними; быстрое построение схем без перетаскивания — кнопки «+» у выделенной фигуры создают её копию со стрелкой; ссылки на внешние ресурсы и документы с просмотром во встроенном окне.</w:t>
+      </w:r>
+    </w:p>
+    <w:p>
+      <w:pPr>
+        <w:pStyle w:val="Heading2"/>
+      </w:pPr>
+      <w:r>
+        <w:t>OKR — цели квартала</w:t>
+      </w:r>
+    </w:p>
+    <w:p>
+      <w:r>
+        <w:t>Цели квартала и прогресс ключевых результатов (Key Results). Раздел перенесён в «Планирование».</w:t>
+      </w:r>
+    </w:p>
+    <w:p>
+      <w:pPr/>
+      <w:r>
+        <w:rPr>
+          <w:i/>
+        </w:rPr>
+        <w:t>Новое в v1.40: прослеживаемость OKR → задачи (поле «OKR» в «Бэклоге») с покрытием целей работой.</w:t>
+      </w:r>
+    </w:p>
+    <w:p>
+      <w:pPr>
+        <w:pStyle w:val="Heading1"/>
+      </w:pPr>
+      <w:r>
+        <w:t>Бэклог и приоритизация</w:t>
+      </w:r>
+    </w:p>
+    <w:p>
+      <w:pPr>
+        <w:pStyle w:val="Heading2"/>
+      </w:pPr>
+      <w:r>
+        <w:t>Бэклог</w:t>
+      </w:r>
+    </w:p>
+    <w:p>
+      <w:r>
+        <w:t>Источник данных для всех метрик: редактируемые задачи (тип, оценка, статус, спринт), приоритет (RICE/MoSCoW) и флаг готовности (DoR) прямо в задаче, поиск, сортировка, авто-набор спринта по ёмкости.</w:t>
+      </w:r>
+    </w:p>
+    <w:p>
+      <w:pPr>
+        <w:pStyle w:val="Heading2"/>
+      </w:pPr>
+      <w:r>
+        <w:t>Иерархия работ (WBS)</w:t>
+      </w:r>
+    </w:p>
+    <w:p>
+      <w:pPr/>
+      <w:r>
+        <w:t>Структура декомпозиции по полю «Родитель» у задач: Эпик → Фича → История → Задача. Оценка и выполнение суммируются снизу вверх (роллап), поэтому у эпика виден совокупный объём и прогресс.</w:t>
       </w:r>
     </w:p>
     <w:p>
@@ -224,87 +331,10 @@
     </w:p>
     <w:p>
       <w:pPr>
-        <w:pStyle w:val="Heading2"/>
-      </w:pPr>
-      <w:r>
-        <w:t>OKR — цели квартала</w:t>
-      </w:r>
-    </w:p>
-    <w:p>
-      <w:r>
-        <w:t>Цели квартала и прогресс ключевых результатов (Key Results). Раздел перенесён в «Планирование».</w:t>
-      </w:r>
-    </w:p>
-    <w:p>
-      <w:pPr/>
-      <w:r>
-        <w:rPr>
-          <w:i/>
-        </w:rPr>
-        <w:t>Новое в v1.40: прослеживаемость OKR → задачи (поле «OKR» в «Бэклоге») с покрытием целей работой.</w:t>
-      </w:r>
-    </w:p>
-    <w:p>
-      <w:pPr>
-        <w:pStyle w:val="Heading2"/>
-      </w:pPr>
-      <w:r>
-        <w:t>Цели спринтов</w:t>
-      </w:r>
-    </w:p>
-    <w:p>
-      <w:pPr/>
-      <w:r>
-        <w:t>Sprint Goal по каждому спринту — единое обязательство команды о создаваемой ценности (а не список задач). У каждой цели есть статус (Запланирована / В работе / Достигнута / Не достигнута / Отменена), а столбец «% факт» считается автоматически как доля задач спринта в статусе «Готово». Текущая цель спринта и её статус выводятся на дашборд.</w:t>
-      </w:r>
-    </w:p>
-    <w:p>
-      <w:pPr>
-        <w:pStyle w:val="Heading2"/>
-      </w:pPr>
-      <w:r>
-        <w:t>Портфель</w:t>
-      </w:r>
-    </w:p>
-    <w:p>
-      <w:pPr/>
-      <w:r>
-        <w:t>Портфельный обзор нескольких проектов: статус RAG, health, velocity, бюджет и прогресс. Кнопка «Снимок текущего проекта» добавляет метрики активного проекта. Обзор здоровья портфеля для PMO.</w:t>
-      </w:r>
-    </w:p>
-    <w:p>
-      <w:pPr>
         <w:pStyle w:val="Heading1"/>
       </w:pPr>
       <w:r>
-        <w:t>Работа</w:t>
-      </w:r>
-    </w:p>
-    <w:p>
-      <w:pPr>
-        <w:pStyle w:val="Heading2"/>
-      </w:pPr>
-      <w:r>
-        <w:t>Бэклог</w:t>
-      </w:r>
-    </w:p>
-    <w:p>
-      <w:r>
-        <w:t>Источник данных для всех метрик: редактируемые задачи (тип, оценка, статус, спринт), приоритет (RICE/MoSCoW) и флаг готовности (DoR) прямо в задаче, поиск, сортировка, авто-набор спринта по ёмкости.</w:t>
-      </w:r>
-    </w:p>
-    <w:p>
-      <w:pPr>
-        <w:pStyle w:val="Heading2"/>
-      </w:pPr>
-      <w:r>
-        <w:t>Иерархия работ (WBS)</w:t>
-      </w:r>
-    </w:p>
-    <w:p>
-      <w:pPr/>
-      <w:r>
-        <w:t>Структура декомпозиции по полю «Родитель» у задач: Эпик → Фича → История → Задача. Оценка и выполнение суммируются снизу вверх (роллап), поэтому у эпика виден совокупный объём и прогресс.</w:t>
+        <w:t>Расписание и зависимости</w:t>
       </w:r>
     </w:p>
     <w:p>
@@ -345,6 +375,27 @@
       <w:pPr/>
       <w:r>
         <w:t>Программная доска (PI Planning, SAFe) — матрица «стрим × спринт», которая показывает межкомандные зависимости и вехи на горизонте программного инкремента. Стрелка ⬅ — мы зависим от стрима, ➡ — стрим зависит от нас, ◆ — веха; цвет отражает статус (получено / ожидается / заблокировано). Красные ячейки — кандидаты на эскалацию.</w:t>
+      </w:r>
+    </w:p>
+    <w:p>
+      <w:pPr>
+        <w:pStyle w:val="Heading2"/>
+      </w:pPr>
+      <w:r>
+        <w:t>Вехи</w:t>
+      </w:r>
+    </w:p>
+    <w:p>
+      <w:r>
+        <w:t>Контрольные точки с привязкой к спринтам и релизам и текущим статусом.</w:t>
+      </w:r>
+    </w:p>
+    <w:p>
+      <w:pPr>
+        <w:pStyle w:val="Heading1"/>
+      </w:pPr>
+      <w:r>
+        <w:t>Команда</w:t>
       </w:r>
     </w:p>
     <w:p>
@@ -417,6 +468,32 @@
     </w:p>
     <w:p>
       <w:pPr>
+        <w:pStyle w:val="Heading2"/>
+      </w:pPr>
+      <w:r>
+        <w:t>График отпусков</w:t>
+      </w:r>
+    </w:p>
+    <w:p>
+      <w:r>
+        <w:t>Отпуска, больничные, отгулы и командировки — для учёта доступности команды.</w:t>
+      </w:r>
+    </w:p>
+    <w:p>
+      <w:pPr>
+        <w:pStyle w:val="Heading2"/>
+      </w:pPr>
+      <w:r>
+        <w:t>Дни рождения</w:t>
+      </w:r>
+    </w:p>
+    <w:p>
+      <w:r>
+        <w:t>Даты рождения участников команды и ближайшие праздники с обратным отсчётом.</w:t>
+      </w:r>
+    </w:p>
+    <w:p>
+      <w:pPr>
         <w:pStyle w:val="Heading1"/>
       </w:pPr>
       <w:r>
@@ -450,12 +527,27 @@
         <w:pStyle w:val="Heading2"/>
       </w:pPr>
       <w:r>
-        <w:t>Вехи</w:t>
+        <w:t>Запросы на изменение (CCB)</w:t>
       </w:r>
     </w:p>
     <w:p>
+      <w:pPr/>
       <w:r>
-        <w:t>Контрольные точки с привязкой к спринтам и релизам и текущим статусом.</w:t>
+        <w:t>Формальный контроль изменений: каждый запрос (scope/срок/стоимость/качество) фиксируется с оценкой влияния и инициатором и проходит решение CCB (одобрить/отклонить/отложить). Защищает базовый план от неконтролируемого роста.</w:t>
+      </w:r>
+    </w:p>
+    <w:p>
+      <w:pPr>
+        <w:pStyle w:val="Heading2"/>
+      </w:pPr>
+      <w:r>
+        <w:t>Контроль scope (scope creep)</w:t>
+      </w:r>
+    </w:p>
+    <w:p>
+      <w:pPr/>
+      <w:r>
+        <w:t>Контроль scope (scope creep) — журнал изменений состава спринтов и релизов: добавления, переносы и удаления задач. Кнопка «Зафиксировать базовый состав» сохраняет текущее распределение задач по спринтам, «Сравнить с базовым» находит отличия и записывает их в лог. Авто-переносы незавершённых задач попадают сюда автоматически.</w:t>
       </w:r>
     </w:p>
     <w:p>
@@ -473,21 +565,15 @@
     </w:p>
     <w:p>
       <w:pPr>
-        <w:pStyle w:val="Heading2"/>
+        <w:pStyle w:val="Heading1"/>
       </w:pPr>
       <w:r>
-        <w:t>Запросы на изменение (CCB)</w:t>
-      </w:r>
-    </w:p>
-    <w:p>
-      <w:pPr/>
-      <w:r>
-        <w:t>Формальный контроль изменений: каждый запрос (scope/срок/стоимость/качество) фиксируется с оценкой влияния и инициатором и проходит решение CCB (одобрить/отклонить/отложить). Защищает базовый план от неконтролируемого роста.</w:t>
+        <w:t>Аналитика и качество</w:t>
       </w:r>
     </w:p>
     <w:p>
       <w:pPr>
-        <w:pStyle w:val="Heading1"/>
+        <w:pStyle w:val="Heading2"/>
       </w:pPr>
       <w:r>
         <w:t>Аналитика</w:t>
@@ -500,14 +586,6 @@
           <w:i/>
         </w:rPr>
         <w:t>Новое в v1.40: Монте-Карло прогноз даты завершения (P50/P85), оценка flow efficiency и SLA/SLO по дефектам.</w:t>
-      </w:r>
-    </w:p>
-    <w:p>
-      <w:pPr>
-        <w:pStyle w:val="Heading2"/>
-      </w:pPr>
-      <w:r>
-        <w:t>Аналитика</w:t>
       </w:r>
     </w:p>
     <w:p>
@@ -689,20 +767,6 @@
         <w:pStyle w:val="Heading2"/>
       </w:pPr>
       <w:r>
-        <w:t>Импедименты</w:t>
-      </w:r>
-    </w:p>
-    <w:p>
-      <w:pPr/>
-      <w:r>
-        <w:t>Журнал препятствий со «старением» (aging), владельцем и серьёзностью; залежавшиеся (&gt; 5 дней) требуют эскалации. Пополняется из блокеров «Дэйли» одной кнопкой.</w:t>
-      </w:r>
-    </w:p>
-    <w:p>
-      <w:pPr>
-        <w:pStyle w:val="Heading2"/>
-      </w:pPr>
-      <w:r>
         <w:t>Ретроспективы</w:t>
       </w:r>
     </w:p>
@@ -726,16 +790,10 @@
     </w:p>
     <w:p>
       <w:pPr>
-        <w:pStyle w:val="Heading2"/>
+        <w:pStyle w:val="Heading1"/>
       </w:pPr>
       <w:r>
-        <w:t>Реестр извлечённых уроков</w:t>
-      </w:r>
-    </w:p>
-    <w:p>
-      <w:pPr/>
-      <w:r>
-        <w:t>База знаний команды: ситуация, извлечённый урок и рекомендация. Пополняется из ретроспектив. В отличие от разовых action items — это долговременные правила, снижающие повторение ошибок.</w:t>
+        <w:t>Здоровье и улучшения</w:t>
       </w:r>
     </w:p>
     <w:p>
@@ -757,6 +815,48 @@
         <w:pStyle w:val="Heading2"/>
       </w:pPr>
       <w:r>
+        <w:t>Импедименты</w:t>
+      </w:r>
+    </w:p>
+    <w:p>
+      <w:pPr/>
+      <w:r>
+        <w:t>Журнал препятствий со «старением» (aging), владельцем и серьёзностью; залежавшиеся (&gt; 5 дней) требуют эскалации. Пополняется из блокеров «Дэйли» одной кнопкой.</w:t>
+      </w:r>
+    </w:p>
+    <w:p>
+      <w:pPr>
+        <w:pStyle w:val="Heading2"/>
+      </w:pPr>
+      <w:r>
+        <w:t>Реестр извлечённых уроков</w:t>
+      </w:r>
+    </w:p>
+    <w:p>
+      <w:pPr/>
+      <w:r>
+        <w:t>База знаний команды: ситуация, извлечённый урок и рекомендация. Пополняется из ретроспектив. В отличие от разовых action items — это долговременные правила, снижающие повторение ошибок.</w:t>
+      </w:r>
+    </w:p>
+    <w:p>
+      <w:pPr>
+        <w:pStyle w:val="Heading2"/>
+      </w:pPr>
+      <w:r>
+        <w:t>Журнал решений (ADR)</w:t>
+      </w:r>
+    </w:p>
+    <w:p>
+      <w:pPr/>
+      <w:r>
+        <w:t>Ключевые проектные и архитектурные решения: контекст, рассмотренные варианты, принятое решение, обоснование и владелец. Сохраняет «почему мы так сделали».</w:t>
+      </w:r>
+    </w:p>
+    <w:p>
+      <w:pPr>
+        <w:pStyle w:val="Heading2"/>
+      </w:pPr>
+      <w:r>
         <w:t>Уровень Agile-зрелости</w:t>
       </w:r>
     </w:p>
@@ -770,7 +870,7 @@
         <w:pStyle w:val="Heading1"/>
       </w:pPr>
       <w:r>
-        <w:t>Персонал</w:t>
+        <w:t>Система</w:t>
       </w:r>
     </w:p>
     <w:p>
@@ -778,12 +878,21 @@
         <w:pStyle w:val="Heading2"/>
       </w:pPr>
       <w:r>
-        <w:t>График отпусков</w:t>
+        <w:t>Параметры</w:t>
       </w:r>
     </w:p>
     <w:p>
       <w:r>
-        <w:t>Отпуска, больничные, отгулы и командировки — для учёта доступности команды.</w:t>
+        <w:t>Базовые параметры: старт проекта, focus factor, критерии готовности (DoD).</w:t>
+      </w:r>
+    </w:p>
+    <w:p>
+      <w:pPr/>
+      <w:r>
+        <w:rPr>
+          <w:i/>
+        </w:rPr>
+        <w:t>Новое в v1.40: Definition of Ready как чеклист рядом с Definition of Done; DoR/DoD работают как «ворота» на доске.</w:t>
       </w:r>
     </w:p>
     <w:p>
@@ -791,33 +900,12 @@
         <w:pStyle w:val="Heading2"/>
       </w:pPr>
       <w:r>
-        <w:t>Дни рождения</w:t>
+        <w:t>Интеграции — Atlassian</w:t>
       </w:r>
     </w:p>
     <w:p>
       <w:r>
-        <w:t>Даты рождения участников команды и ближайшие праздники с обратным отсчётом.</w:t>
-      </w:r>
-    </w:p>
-    <w:p>
-      <w:pPr>
-        <w:pStyle w:val="Heading1"/>
-      </w:pPr>
-      <w:r>
-        <w:t>Настройки</w:t>
-      </w:r>
-    </w:p>
-    <w:p>
-      <w:pPr>
-        <w:pStyle w:val="Heading2"/>
-      </w:pPr>
-      <w:r>
-        <w:t>Бюджет</w:t>
-      </w:r>
-    </w:p>
-    <w:p>
-      <w:r>
-        <w:t>Стоимость по ёмкости команды и накопленный расход проекта.</w:t>
+        <w:t>Интеграция со всеми продуктами Atlassian: Jira, Jira Service Management, Jira Product Discovery, Confluence, Compass, Bitbucket, Trello, Opsgenie, Statuspage и Bamboo. Каталог продуктов со статусом подключения и проверкой; ключи задаются на сервере переменными окружения.</w:t>
       </w:r>
     </w:p>
     <w:p>
@@ -838,27 +926,12 @@
         <w:pStyle w:val="Heading2"/>
       </w:pPr>
       <w:r>
-        <w:t>Контроль scope (scope creep)</w:t>
+        <w:t>Бюджет</w:t>
       </w:r>
     </w:p>
     <w:p>
-      <w:pPr/>
       <w:r>
-        <w:t>Контроль scope (scope creep) — журнал изменений состава спринтов и релизов: добавления, переносы и удаления задач. Кнопка «Зафиксировать базовый состав» сохраняет текущее распределение задач по спринтам, «Сравнить с базовым» находит отличия и записывает их в лог. Авто-переносы незавершённых задач попадают сюда автоматически.</w:t>
-      </w:r>
-    </w:p>
-    <w:p>
-      <w:pPr>
-        <w:pStyle w:val="Heading2"/>
-      </w:pPr>
-      <w:r>
-        <w:t>Журнал решений (ADR)</w:t>
-      </w:r>
-    </w:p>
-    <w:p>
-      <w:pPr/>
-      <w:r>
-        <w:t>Ключевые проектные и архитектурные решения: контекст, рассмотренные варианты, принятое решение, обоснование и владелец. Сохраняет «почему мы так сделали».</w:t>
+        <w:t>Стоимость по ёмкости команды и накопленный расход проекта.</w:t>
       </w:r>
     </w:p>
     <w:p>
@@ -892,34 +965,12 @@
         <w:pStyle w:val="Heading2"/>
       </w:pPr>
       <w:r>
-        <w:t>Интеграции — Atlassian</w:t>
+        <w:t>Журнал событий</w:t>
       </w:r>
     </w:p>
     <w:p>
       <w:r>
-        <w:t>Интеграция со всеми продуктами Atlassian: Jira, Jira Service Management, Jira Product Discovery, Confluence, Compass, Bitbucket, Trello, Opsgenie, Statuspage и Bamboo. Каталог продуктов со статусом подключения и проверкой; ключи задаются на сервере переменными окружения.</w:t>
-      </w:r>
-    </w:p>
-    <w:p>
-      <w:pPr>
-        <w:pStyle w:val="Heading2"/>
-      </w:pPr>
-      <w:r>
-        <w:t>Параметры</w:t>
-      </w:r>
-    </w:p>
-    <w:p>
-      <w:r>
-        <w:t>Базовые параметры: старт проекта, focus factor, критерии готовности (DoD).</w:t>
-      </w:r>
-    </w:p>
-    <w:p>
-      <w:pPr/>
-      <w:r>
-        <w:rPr>
-          <w:i/>
-        </w:rPr>
-        <w:t>Новое в v1.40: Definition of Ready как чеклист рядом с Definition of Done; DoR/DoD работают как «ворота» на доске.</w:t>
+        <w:t>«История изменений» (версии приложения) видна всем; полный журнал всех событий сервера — администратору (отдельная база PostgreSQL).</w:t>
       </w:r>
     </w:p>
     <w:p>
@@ -948,39 +999,12 @@
         <w:pStyle w:val="Heading2"/>
       </w:pPr>
       <w:r>
-        <w:t>Статус-отчёт</w:t>
-      </w:r>
-    </w:p>
-    <w:p>
-      <w:pPr/>
-      <w:r>
-        <w:t>Автоматический статус-отчёт (RAG) из текущих данных проекта: ключевые метрики, цель спринта, риски, эскалации и сделанное. Экспорт в Markdown и отправка в Slack.</w:t>
-      </w:r>
-    </w:p>
-    <w:p>
-      <w:pPr>
-        <w:pStyle w:val="Heading2"/>
-      </w:pPr>
-      <w:r>
         <w:t>Support</w:t>
       </w:r>
     </w:p>
     <w:p>
       <w:r>
         <w:t>Центр загрузки документов по приложению (руководство пользователя, иллюстрированное описание, презентация, видео-обзор) и каналы поддержки. Руководство администратора здесь не размещается.</w:t>
-      </w:r>
-    </w:p>
-    <w:p>
-      <w:pPr>
-        <w:pStyle w:val="Heading2"/>
-      </w:pPr>
-      <w:r>
-        <w:t>Журнал событий</w:t>
-      </w:r>
-    </w:p>
-    <w:p>
-      <w:r>
-        <w:t>«История изменений» (версии приложения) видна всем; полный журнал всех событий сервера — администратору (отдельная база PostgreSQL).</w:t>
       </w:r>
     </w:p>
     <w:p>

</xml_diff>